<commit_message>
ameco-eurostat update 2026-07-13 15:35:19 NB-PBU-T14S
</commit_message>
<xml_diff>
--- a/doc/2026-04-22-Projektplanung-bis-Mai-2026.docx
+++ b/doc/2026-04-22-Projektplanung-bis-Mai-2026.docx
@@ -7,12 +7,14 @@
         <w:rPr>
           <w:b/>
           <w:bCs/>
+          <w:lang w:val="de-DE"/>
         </w:rPr>
       </w:pPr>
       <w:r>
         <w:rPr>
           <w:b/>
           <w:bCs/>
+          <w:lang w:val="de-DE"/>
         </w:rPr>
         <w:t>Besprechung 22.4.26</w:t>
       </w:r>
@@ -22,6 +24,7 @@
         <w:rPr>
           <w:b/>
           <w:bCs/>
+          <w:lang w:val="de-DE"/>
         </w:rPr>
       </w:pPr>
     </w:p>
@@ -30,12 +33,14 @@
         <w:rPr>
           <w:b/>
           <w:bCs/>
+          <w:lang w:val="de-DE"/>
         </w:rPr>
       </w:pPr>
       <w:r>
         <w:rPr>
           <w:b/>
           <w:bCs/>
+          <w:lang w:val="de-DE"/>
         </w:rPr>
         <w:t>Ziel:</w:t>
       </w:r>
@@ -336,7 +341,19 @@
         <w:rPr>
           <w:lang w:val="de-DE"/>
         </w:rPr>
-        <w:t>Landkarte mit Scores Ratsmitglieder: einzeitlich zwei Stellen hinter dem Komma, bei missing values keine „0“, sondern „-„</w:t>
+        <w:t>Landkarte mit Scores Ratsmitglieder: ein</w:t>
+      </w:r>
+      <w:r>
+        <w:rPr>
+          <w:lang w:val="de-DE"/>
+        </w:rPr>
+        <w:t>h</w:t>
+      </w:r>
+      <w:r>
+        <w:rPr>
+          <w:lang w:val="de-DE"/>
+        </w:rPr>
+        <w:t>eitlich zwei Stellen hinter dem Komma, bei missing values keine „0“, sondern „-„</w:t>
       </w:r>
     </w:p>
     <w:p>
@@ -415,25 +432,17 @@
         <w:rPr>
           <w:b/>
           <w:bCs/>
-          <w:lang w:val="de-DE"/>
         </w:rPr>
       </w:pPr>
       <w:r>
         <w:rPr>
           <w:b/>
           <w:bCs/>
-          <w:lang w:val="de-DE"/>
         </w:rPr>
         <w:t>Protokoll EZB-Monitor</w:t>
       </w:r>
     </w:p>
-    <w:p>
-      <w:pPr>
-        <w:rPr>
-          <w:lang w:val="de-DE"/>
-        </w:rPr>
-      </w:pPr>
-    </w:p>
+    <w:p/>
     <w:p>
       <w:r>
         <w:t>Fiscal Landscape:</w:t>
@@ -472,6 +481,7 @@
         <w:rPr>
           <w:lang w:val="de-DE"/>
         </w:rPr>
+        <w:lastRenderedPageBreak/>
         <w:t>Peter/Friedrich: Nein nur ganz Liste aber einfache gestaltet, nicht wie bei Eurostat</w:t>
       </w:r>
     </w:p>
@@ -1186,6 +1196,12 @@
           <w:rFonts w:eastAsia="Times New Roman"/>
         </w:rPr>
         <w:br/>
+      </w:r>
+      <w:r>
+        <w:rPr>
+          <w:rFonts w:eastAsia="Times New Roman"/>
+        </w:rPr>
+        <w:lastRenderedPageBreak/>
         <w:t>Alternatively - stretch the transition range where green merges into red - to provide more nuance</w:t>
       </w:r>
     </w:p>

</xml_diff>

<commit_message>
ameco-eurostat update 2026-07-14 18:33:40 NB-PBU-T14S
</commit_message>
<xml_diff>
--- a/doc/2026-04-22-Projektplanung-bis-Mai-2026.docx
+++ b/doc/2026-04-22-Projektplanung-bis-Mai-2026.docx
@@ -365,9 +365,10 @@
         </w:numPr>
       </w:pPr>
       <w:r>
-        <w:t>CSV download files for full-history and for 6-weeks-council-stance.</w:t>
-      </w:r>
-    </w:p>
+        <w:t>Prevent repeated clicking on "play" button</w:t>
+      </w:r>
+    </w:p>
+    <w:p/>
     <w:p>
       <w:pPr>
         <w:pStyle w:val="Listenabsatz"/>
@@ -377,8 +378,28 @@
         </w:numPr>
       </w:pPr>
       <w:r>
-        <w:t>Prevent repeated clicking on "play" button</w:t>
-      </w:r>
+        <w:t xml:space="preserve">CSV download files for </w:t>
+      </w:r>
+      <w:r>
+        <w:t xml:space="preserve"> </w:t>
+      </w:r>
+      <w:r>
+        <w:br/>
+      </w:r>
+      <w:r>
+        <w:t>full-history</w:t>
+      </w:r>
+      <w:r>
+        <w:br/>
+      </w:r>
+      <w:r>
+        <w:t>6-weeks-council</w:t>
+      </w:r>
+    </w:p>
+    <w:p>
+      <w:pPr>
+        <w:pStyle w:val="Listenabsatz"/>
+      </w:pPr>
     </w:p>
     <w:p>
       <w:pPr>
@@ -389,6 +410,23 @@
         </w:numPr>
       </w:pPr>
       <w:r>
+        <w:t>ECB session dates and ECB rates should be automatic.</w:t>
+      </w:r>
+    </w:p>
+    <w:p>
+      <w:pPr>
+        <w:pStyle w:val="Listenabsatz"/>
+      </w:pPr>
+    </w:p>
+    <w:p>
+      <w:pPr>
+        <w:pStyle w:val="Listenabsatz"/>
+        <w:numPr>
+          <w:ilvl w:val="0"/>
+          <w:numId w:val="4"/>
+        </w:numPr>
+      </w:pPr>
+      <w:r>
         <w:t xml:space="preserve">Steuerung Vergabe für: </w:t>
       </w:r>
       <w:r>
@@ -405,18 +443,6 @@
       </w:pPr>
       <w:r>
         <w:t>Speech crawler and LLM extraction automatically on the server</w:t>
-      </w:r>
-    </w:p>
-    <w:p>
-      <w:pPr>
-        <w:pStyle w:val="Listenabsatz"/>
-        <w:numPr>
-          <w:ilvl w:val="0"/>
-          <w:numId w:val="4"/>
-        </w:numPr>
-      </w:pPr>
-      <w:r>
-        <w:t>ECB session dates and ECB rates should be automatic.</w:t>
       </w:r>
     </w:p>
     <w:p>
@@ -439,6 +465,7 @@
           <w:b/>
           <w:bCs/>
         </w:rPr>
+        <w:lastRenderedPageBreak/>
         <w:t>Protokoll EZB-Monitor</w:t>
       </w:r>
     </w:p>
@@ -481,7 +508,6 @@
         <w:rPr>
           <w:lang w:val="de-DE"/>
         </w:rPr>
-        <w:lastRenderedPageBreak/>
         <w:t>Peter/Friedrich: Nein nur ganz Liste aber einfache gestaltet, nicht wie bei Eurostat</w:t>
       </w:r>
     </w:p>
@@ -1148,6 +1174,7 @@
         <w:rPr>
           <w:lang w:val="de-DE"/>
         </w:rPr>
+        <w:lastRenderedPageBreak/>
         <w:t xml:space="preserve">sind aus </w:t>
       </w:r>
       <w:r>
@@ -1196,12 +1223,6 @@
           <w:rFonts w:eastAsia="Times New Roman"/>
         </w:rPr>
         <w:br/>
-      </w:r>
-      <w:r>
-        <w:rPr>
-          <w:rFonts w:eastAsia="Times New Roman"/>
-        </w:rPr>
-        <w:lastRenderedPageBreak/>
         <w:t>Alternatively - stretch the transition range where green merges into red - to provide more nuance</w:t>
       </w:r>
     </w:p>

</xml_diff>